<commit_message>
La til gitignore og endret litt i arbeidskrav 4
</commit_message>
<xml_diff>
--- a/Arbeidskrav M12.docx
+++ b/Arbeidskrav M12.docx
@@ -3,137 +3,255 @@
 <w:document xmlns:wpc="http://schemas.microsoft.com/office/word/2010/wordprocessingCanvas" xmlns:cx="http://schemas.microsoft.com/office/drawing/2014/chartex" xmlns:cx1="http://schemas.microsoft.com/office/drawing/2015/9/8/chartex" xmlns:cx2="http://schemas.microsoft.com/office/drawing/2015/10/21/chartex" xmlns:cx3="http://schemas.microsoft.com/office/drawing/2016/5/9/chartex" xmlns:cx4="http://schemas.microsoft.com/office/drawing/2016/5/10/chartex" xmlns:cx5="http://schemas.microsoft.com/office/drawing/2016/5/11/chartex" xmlns:cx6="http://schemas.microsoft.com/office/drawing/2016/5/12/chartex" xmlns:cx7="http://schemas.microsoft.com/office/drawing/2016/5/13/chartex" xmlns:cx8="http://schemas.microsoft.com/office/drawing/2016/5/14/chartex" xmlns:mc="http://schemas.openxmlformats.org/markup-compatibility/2006" xmlns:aink="http://schemas.microsoft.com/office/drawing/2016/ink" xmlns:am3d="http://schemas.microsoft.com/office/drawing/2017/model3d" xmlns:o="urn:schemas-microsoft-com:office:office" xmlns:oel="http://schemas.microsoft.com/office/2019/extlst" xmlns:r="http://schemas.openxmlformats.org/officeDocument/2006/relationships" xmlns:m="http://schemas.openxmlformats.org/officeDocument/2006/math" xmlns:v="urn:schemas-microsoft-com:vml" xmlns:wp14="http://schemas.microsoft.com/office/word/2010/wordprocessingDrawing" xmlns:wp="http://schemas.openxmlformats.org/drawingml/2006/wordprocessingDrawing" xmlns:w10="urn:schemas-microsoft-com:office:word" xmlns:w="http://schemas.openxmlformats.org/wordprocessingml/2006/main" xmlns:w14="http://schemas.microsoft.com/office/word/2010/wordml" xmlns:w15="http://schemas.microsoft.com/office/word/2012/wordml" xmlns:w16cex="http://schemas.microsoft.com/office/word/2018/wordml/cex" xmlns:w16cid="http://schemas.microsoft.com/office/word/2016/wordml/cid" xmlns:w16="http://schemas.microsoft.com/office/word/2018/wordml" xmlns:w16du="http://schemas.microsoft.com/office/word/2023/wordml/word16du" xmlns:w16sdtdh="http://schemas.microsoft.com/office/word/2020/wordml/sdtdatahash" xmlns:w16sdtfl="http://schemas.microsoft.com/office/word/2024/wordml/sdtformatlock" xmlns:w16se="http://schemas.microsoft.com/office/word/2015/wordml/symex" xmlns:wpg="http://schemas.microsoft.com/office/word/2010/wordprocessingGroup" xmlns:wpi="http://schemas.microsoft.com/office/word/2010/wordprocessingInk" xmlns:wne="http://schemas.microsoft.com/office/word/2006/wordml" xmlns:wps="http://schemas.microsoft.com/office/word/2010/wordprocessingShape" mc:Ignorable="w14 w15 w16se w16cid w16 w16cex w16sdtdh w16sdtfl w16du wp14">
   <w:body>
     <w:p>
-      <w:r>
+      <w:pPr>
+        <w:rPr>
+          <w:sz w:val="32"/>
+          <w:szCs w:val="32"/>
+        </w:rPr>
+      </w:pPr>
+      <w:r>
+        <w:rPr>
+          <w:sz w:val="32"/>
+          <w:szCs w:val="32"/>
+        </w:rPr>
         <w:t>Matematikk M12</w:t>
       </w:r>
     </w:p>
+    <w:p>
+      <w:pPr>
+        <w:rPr>
+          <w:b/>
+          <w:bCs/>
+        </w:rPr>
+      </w:pPr>
+      <w:r>
+        <w:rPr>
+          <w:b/>
+          <w:bCs/>
+        </w:rPr>
+        <w:t>Oppgave 1</w:t>
+      </w:r>
+    </w:p>
+    <w:p>
+      <w:r>
+        <w:t>a)</w:t>
+      </w:r>
+    </w:p>
     <w:p/>
     <w:p>
-      <w:r>
-        <w:t>Oppgave 1 a)</w:t>
+      <w:proofErr w:type="spellStart"/>
+      <w:r>
+        <w:t>def</w:t>
+      </w:r>
+      <w:proofErr w:type="spellEnd"/>
+      <w:r>
+        <w:t xml:space="preserve"> f(x): #Definer en funksjon</w:t>
+      </w:r>
+    </w:p>
+    <w:p>
+      <w:r>
+        <w:t xml:space="preserve">    </w:t>
+      </w:r>
+      <w:proofErr w:type="spellStart"/>
+      <w:r>
+        <w:t>return</w:t>
+      </w:r>
+      <w:proofErr w:type="spellEnd"/>
+      <w:r>
+        <w:t xml:space="preserve"> (x+7)/(2+x**2) #Funksjonen returnerer regnestykket med x som en variabel</w:t>
       </w:r>
     </w:p>
     <w:p/>
     <w:p>
+      <w:r>
+        <w:t>x = 0 #Definerer variabelen x som 0</w:t>
+      </w:r>
+    </w:p>
+    <w:p>
+      <w:r>
+        <w:t>h = 0.001 #Definerer variabelen h som 0.001</w:t>
+      </w:r>
+    </w:p>
+    <w:p/>
+    <w:p>
       <w:proofErr w:type="spellStart"/>
       <w:r>
-        <w:t>def</w:t>
+        <w:t>while</w:t>
       </w:r>
       <w:proofErr w:type="spellEnd"/>
       <w:r>
-        <w:t xml:space="preserve"> f(x): #Definer en funksjon</w:t>
-      </w:r>
-    </w:p>
-    <w:p>
-      <w:r>
-        <w:t xml:space="preserve">    </w:t>
+        <w:t xml:space="preserve"> f(x) &lt;= f(</w:t>
       </w:r>
       <w:proofErr w:type="spellStart"/>
       <w:r>
-        <w:t>return</w:t>
+        <w:t>x+h</w:t>
       </w:r>
       <w:proofErr w:type="spellEnd"/>
       <w:r>
-        <w:t xml:space="preserve"> (x+7)/(2+x**2) #Funksjonen returnerer regnestykket med x som en variabel</w:t>
+        <w:t>):   #While loop som kjører enn så lenge f(x) er mindre eller lik f(</w:t>
+      </w:r>
+      <w:proofErr w:type="spellStart"/>
+      <w:r>
+        <w:t>x+h</w:t>
+      </w:r>
+      <w:proofErr w:type="spellEnd"/>
+      <w:r>
+        <w:t>)</w:t>
+      </w:r>
+    </w:p>
+    <w:p>
+      <w:r>
+        <w:t>    x=</w:t>
+      </w:r>
+      <w:proofErr w:type="spellStart"/>
+      <w:r>
+        <w:t>x+h</w:t>
+      </w:r>
+      <w:proofErr w:type="spellEnd"/>
+      <w:r>
+        <w:t xml:space="preserve">               #Øker x med h som er veldig lite, derav derivasjon</w:t>
       </w:r>
     </w:p>
     <w:p/>
     <w:p>
-      <w:r>
-        <w:t>x = 0 #Definerer variabelen x som 0</w:t>
-      </w:r>
-    </w:p>
-    <w:p>
-      <w:r>
-        <w:t>h = 0.001 #Definerer variabelen h som 0.001</w:t>
+      <w:proofErr w:type="spellStart"/>
+      <w:r>
+        <w:t>print</w:t>
+      </w:r>
+      <w:proofErr w:type="spellEnd"/>
+      <w:r>
+        <w:t xml:space="preserve"> (x)               #Skriver ut variabelen x</w:t>
       </w:r>
     </w:p>
     <w:p/>
     <w:p>
+      <w:r>
+        <w:t>b)</w:t>
+      </w:r>
+    </w:p>
+    <w:p>
+      <w:r>
+        <w:t xml:space="preserve">Programmet </w:t>
+      </w:r>
+      <w:r>
+        <w:t>finner</w:t>
+      </w:r>
+      <w:r>
+        <w:t xml:space="preserve"> toppunktet til f(x).</w:t>
+      </w:r>
+    </w:p>
+    <w:p/>
+    <w:p>
+      <w:r>
+        <w:t>c)</w:t>
+      </w:r>
+    </w:p>
+    <w:p/>
+    <w:p/>
+    <w:p>
+      <w:r>
+        <w:t>d)</w:t>
+      </w:r>
+    </w:p>
+    <w:p/>
+    <w:p/>
+    <w:p>
+      <w:r>
+        <w:t xml:space="preserve">e) </w:t>
+      </w:r>
+    </w:p>
+    <w:p/>
+    <w:p/>
+    <w:p>
+      <w:pPr>
+        <w:rPr>
+          <w:b/>
+          <w:bCs/>
+        </w:rPr>
+      </w:pPr>
+      <w:r>
+        <w:rPr>
+          <w:b/>
+          <w:bCs/>
+        </w:rPr>
+        <w:t>Oppgave 2</w:t>
+      </w:r>
+    </w:p>
+    <w:p>
+      <w:pPr>
+        <w:pStyle w:val="Listeavsnitt"/>
+        <w:numPr>
+          <w:ilvl w:val="0"/>
+          <w:numId w:val="3"/>
+        </w:numPr>
+      </w:pPr>
       <w:proofErr w:type="spellStart"/>
       <w:r>
+        <w:t>Df</w:t>
+      </w:r>
+      <w:proofErr w:type="spellEnd"/>
+      <w:r>
+        <w:t xml:space="preserve"> på linje 8-9 deriverer </w:t>
+      </w:r>
+      <w:r>
+        <w:t>koden f(x)</w:t>
+      </w:r>
+    </w:p>
+    <w:p>
+      <w:pPr>
+        <w:pStyle w:val="Listeavsnitt"/>
+        <w:numPr>
+          <w:ilvl w:val="0"/>
+          <w:numId w:val="3"/>
+        </w:numPr>
+      </w:pPr>
+      <w:r>
+        <w:lastRenderedPageBreak/>
+        <w:t xml:space="preserve">I </w:t>
+      </w:r>
+      <w:proofErr w:type="spellStart"/>
+      <w:r>
         <w:t>while</w:t>
       </w:r>
       <w:proofErr w:type="spellEnd"/>
       <w:r>
-        <w:t xml:space="preserve"> f(x) &lt;= f(</w:t>
-      </w:r>
-      <w:proofErr w:type="spellStart"/>
-      <w:r>
-        <w:t>x+h</w:t>
-      </w:r>
-      <w:proofErr w:type="spellEnd"/>
-      <w:r>
-        <w:t>):   #While loop som kjører enn så lenge f(x) er mindre eller lik f(</w:t>
-      </w:r>
-      <w:proofErr w:type="spellStart"/>
-      <w:r>
-        <w:t>x+h</w:t>
-      </w:r>
-      <w:proofErr w:type="spellEnd"/>
-      <w:r>
-        <w:t>)</w:t>
-      </w:r>
-    </w:p>
-    <w:p>
-      <w:r>
-        <w:t>    x=</w:t>
-      </w:r>
-      <w:proofErr w:type="spellStart"/>
-      <w:r>
-        <w:t>x+h</w:t>
-      </w:r>
-      <w:proofErr w:type="spellEnd"/>
-      <w:r>
-        <w:t xml:space="preserve">               #Øker x med h som er veldig lite, derav derivasjon</w:t>
+        <w:t xml:space="preserve">-løkka </w:t>
+      </w:r>
+      <w:r>
+        <w:t>øker den verdien av x0 til den deriverte blir nær null, slik at den finner toppunktet.</w:t>
+      </w:r>
+    </w:p>
+    <w:p>
+      <w:pPr>
+        <w:pStyle w:val="Listeavsnitt"/>
+        <w:numPr>
+          <w:ilvl w:val="0"/>
+          <w:numId w:val="3"/>
+        </w:numPr>
+      </w:pPr>
+      <w:r>
+        <w:t>For at programmet skal gi riktig x-verdi må man senke verdien av dx. Når dx er 0.5</w:t>
+      </w:r>
+      <w:r>
+        <w:t xml:space="preserve"> øker den x verdien i dx(x) med 0.5 hver gang som gjør at den går glipp av noen verdier eller ikke kommer helt frem til riktig svar.</w:t>
+      </w:r>
+      <w:r>
+        <w:t xml:space="preserve"> </w:t>
       </w:r>
     </w:p>
     <w:p/>
     <w:p>
-      <w:proofErr w:type="spellStart"/>
-      <w:r>
-        <w:t>print</w:t>
-      </w:r>
-      <w:proofErr w:type="spellEnd"/>
-      <w:r>
-        <w:t xml:space="preserve"> (x)               #Skriver ut variabelen x</w:t>
-      </w:r>
-    </w:p>
-    <w:p/>
-    <w:p>
-      <w:r>
-        <w:t>b)</w:t>
-      </w:r>
-    </w:p>
-    <w:p>
-      <w:r>
-        <w:t xml:space="preserve">Programmet </w:t>
-      </w:r>
-      <w:r>
-        <w:t xml:space="preserve">finner ut </w:t>
-      </w:r>
-      <w:r>
-        <w:t>når den deriverte er null</w:t>
-      </w:r>
-      <w:r>
-        <w:t xml:space="preserve"> </w:t>
-      </w:r>
-    </w:p>
-    <w:p/>
-    <w:p>
-      <w:r>
-        <w:t>c)</w:t>
-      </w:r>
-    </w:p>
-    <w:p/>
-    <w:p>
-      <w:r>
-        <w:t>d)</w:t>
-      </w:r>
-    </w:p>
-    <w:p/>
-    <w:p>
-      <w:r>
+      <w:pPr>
+        <w:rPr>
+          <w:b/>
+          <w:bCs/>
+        </w:rPr>
+      </w:pPr>
+      <w:r>
+        <w:rPr>
+          <w:b/>
+          <w:bCs/>
+        </w:rPr>
         <w:t>Oppgave 3</w:t>
       </w:r>
     </w:p>
@@ -183,6 +301,63 @@
           <w:numId w:val="2"/>
         </w:numPr>
       </w:pPr>
+    </w:p>
+    <w:p/>
+    <w:p>
+      <w:pPr>
+        <w:rPr>
+          <w:b/>
+          <w:bCs/>
+        </w:rPr>
+      </w:pPr>
+      <w:r>
+        <w:rPr>
+          <w:b/>
+          <w:bCs/>
+        </w:rPr>
+        <w:t>Oppgave 4</w:t>
+      </w:r>
+    </w:p>
+    <w:p>
+      <w:r>
+        <w:t>a)</w:t>
+      </w:r>
+      <w:r>
+        <w:t xml:space="preserve"> Donald kan regne ut avstanden </w:t>
+      </w:r>
+      <w:r>
+        <w:t xml:space="preserve">med </w:t>
+      </w:r>
+      <w:r>
+        <w:t xml:space="preserve">trapesavstanden ved å bruke </w:t>
+      </w:r>
+      <w:r>
+        <w:t>½ f(a) + f(</w:t>
+      </w:r>
+      <w:proofErr w:type="spellStart"/>
+      <w:r>
+        <w:t>a+dx</w:t>
+      </w:r>
+      <w:proofErr w:type="spellEnd"/>
+      <w:r>
+        <w:t>) + f(a+2dx) + … + ½ f(b)</w:t>
+      </w:r>
+      <w:r>
+        <w:t>. Det vil gi tilbakelagt avstand</w:t>
+      </w:r>
+    </w:p>
+    <w:p>
+      <w:r>
+        <w:t>b)</w:t>
+      </w:r>
+    </w:p>
+    <w:p>
+      <w:r>
+        <w:t xml:space="preserve">c) For at avstanden fra oppgave b skal være nøyaktig må man anta at Donald kjørte med den samme </w:t>
+      </w:r>
+      <w:r>
+        <w:t>farten i de 15 minuttene.</w:t>
+      </w:r>
     </w:p>
     <w:p/>
     <w:sectPr>
@@ -287,6 +462,95 @@
     </w:lvl>
   </w:abstractNum>
   <w:abstractNum w:abstractNumId="1" w15:restartNumberingAfterBreak="0">
+    <w:nsid w:val="488E30F4"/>
+    <w:multiLevelType w:val="hybridMultilevel"/>
+    <w:tmpl w:val="6B9CAF76"/>
+    <w:lvl w:ilvl="0" w:tplc="04140017">
+      <w:start w:val="1"/>
+      <w:numFmt w:val="lowerLetter"/>
+      <w:lvlText w:val="%1)"/>
+      <w:lvlJc w:val="left"/>
+      <w:pPr>
+        <w:ind w:left="720" w:hanging="360"/>
+      </w:pPr>
+      <w:rPr>
+        <w:rFonts w:hint="default"/>
+      </w:rPr>
+    </w:lvl>
+    <w:lvl w:ilvl="1" w:tplc="04140019" w:tentative="1">
+      <w:start w:val="1"/>
+      <w:numFmt w:val="lowerLetter"/>
+      <w:lvlText w:val="%2."/>
+      <w:lvlJc w:val="left"/>
+      <w:pPr>
+        <w:ind w:left="1440" w:hanging="360"/>
+      </w:pPr>
+    </w:lvl>
+    <w:lvl w:ilvl="2" w:tplc="0414001B" w:tentative="1">
+      <w:start w:val="1"/>
+      <w:numFmt w:val="lowerRoman"/>
+      <w:lvlText w:val="%3."/>
+      <w:lvlJc w:val="right"/>
+      <w:pPr>
+        <w:ind w:left="2160" w:hanging="180"/>
+      </w:pPr>
+    </w:lvl>
+    <w:lvl w:ilvl="3" w:tplc="0414000F" w:tentative="1">
+      <w:start w:val="1"/>
+      <w:numFmt w:val="decimal"/>
+      <w:lvlText w:val="%4."/>
+      <w:lvlJc w:val="left"/>
+      <w:pPr>
+        <w:ind w:left="2880" w:hanging="360"/>
+      </w:pPr>
+    </w:lvl>
+    <w:lvl w:ilvl="4" w:tplc="04140019" w:tentative="1">
+      <w:start w:val="1"/>
+      <w:numFmt w:val="lowerLetter"/>
+      <w:lvlText w:val="%5."/>
+      <w:lvlJc w:val="left"/>
+      <w:pPr>
+        <w:ind w:left="3600" w:hanging="360"/>
+      </w:pPr>
+    </w:lvl>
+    <w:lvl w:ilvl="5" w:tplc="0414001B" w:tentative="1">
+      <w:start w:val="1"/>
+      <w:numFmt w:val="lowerRoman"/>
+      <w:lvlText w:val="%6."/>
+      <w:lvlJc w:val="right"/>
+      <w:pPr>
+        <w:ind w:left="4320" w:hanging="180"/>
+      </w:pPr>
+    </w:lvl>
+    <w:lvl w:ilvl="6" w:tplc="0414000F" w:tentative="1">
+      <w:start w:val="1"/>
+      <w:numFmt w:val="decimal"/>
+      <w:lvlText w:val="%7."/>
+      <w:lvlJc w:val="left"/>
+      <w:pPr>
+        <w:ind w:left="5040" w:hanging="360"/>
+      </w:pPr>
+    </w:lvl>
+    <w:lvl w:ilvl="7" w:tplc="04140019" w:tentative="1">
+      <w:start w:val="1"/>
+      <w:numFmt w:val="lowerLetter"/>
+      <w:lvlText w:val="%8."/>
+      <w:lvlJc w:val="left"/>
+      <w:pPr>
+        <w:ind w:left="5760" w:hanging="360"/>
+      </w:pPr>
+    </w:lvl>
+    <w:lvl w:ilvl="8" w:tplc="0414001B" w:tentative="1">
+      <w:start w:val="1"/>
+      <w:numFmt w:val="lowerRoman"/>
+      <w:lvlText w:val="%9."/>
+      <w:lvlJc w:val="right"/>
+      <w:pPr>
+        <w:ind w:left="6480" w:hanging="180"/>
+      </w:pPr>
+    </w:lvl>
+  </w:abstractNum>
+  <w:abstractNum w:abstractNumId="2" w15:restartNumberingAfterBreak="0">
     <w:nsid w:val="72FA3FF1"/>
     <w:multiLevelType w:val="hybridMultilevel"/>
     <w:tmpl w:val="C1AC85B6"/>
@@ -376,10 +640,13 @@
     </w:lvl>
   </w:abstractNum>
   <w:num w:numId="1" w16cid:durableId="771163605">
-    <w:abstractNumId w:val="1"/>
+    <w:abstractNumId w:val="2"/>
   </w:num>
   <w:num w:numId="2" w16cid:durableId="1085417985">
     <w:abstractNumId w:val="0"/>
+  </w:num>
+  <w:num w:numId="3" w16cid:durableId="812869816">
+    <w:abstractNumId w:val="1"/>
   </w:num>
 </w:numbering>
 </file>

</xml_diff>